<commit_message>
feat: add personal web page (page web) to all Word and PDF documents
</commit_message>
<xml_diff>
--- a/Ho-So-Ung-Tuyen/CV-Le-Tran-Thanh-Uyen.docx
+++ b/Ho-So-Ung-Tuyen/CV-Le-Tran-Thanh-Uyen.docx
@@ -65,7 +65,7 @@
               <w:br/>
               <w:t>📞 Điện thoại / Zalo: 0706 700 528   |   ✉️ Email: thanhuyenletran@gmail.com</w:t>
               <w:br/>
-              <w:t>🌐 Website Portfolio: https://uyenpoe.github.io/cv-letranthanhuyen/   |   🐙 GitHub: https://github.com/UyenPoe</w:t>
+              <w:t>🌐 Page Web: https://uyenpoe.github.io/cv-letranthanhuyen/   |   🐙 GitHub: https://github.com/UyenPoe</w:t>
             </w:r>
           </w:p>
         </w:tc>
@@ -461,6 +461,29 @@
           <w:color w:val="1F2937"/>
           <w:sz w:val="22"/>
         </w:rPr>
+        <w:t xml:space="preserve">Page Web Cá Nhân &amp; Hồ Sơ Năng Lực Trực Tuyến (uyenpoe.github.io/cv-letranthanhuyen): </w:t>
+      </w:r>
+      <w:r>
+        <w:rPr>
+          <w:rFonts w:ascii="Arial" w:hAnsi="Arial"/>
+          <w:color w:val="1F2937"/>
+          <w:sz w:val="22"/>
+        </w:rPr>
+        <w:t>Website cá nhân tương tác trực tuyến xây dựng chuẩn responsive, tích hợp xem và tải hồ sơ xin việc (PDF &amp; Word), bộ lọc dự án và minh chứng kết quả đo lường thực tế.</w:t>
+      </w:r>
+    </w:p>
+    <w:p>
+      <w:pPr>
+        <w:pStyle w:val="ListBullet"/>
+        <w:spacing w:before="40" w:after="60" w:line="288" w:lineRule="auto"/>
+      </w:pPr>
+      <w:r>
+        <w:rPr>
+          <w:rFonts w:ascii="Arial" w:hAnsi="Arial"/>
+          <w:b/>
+          <w:color w:val="1F2937"/>
+          <w:sz w:val="22"/>
+        </w:rPr>
         <w:t xml:space="preserve">Cầu Trục Thới An &amp; Cân Hoàng Thiên (cautructhoian.vn · hoangthienscale.com): </w:t>
       </w:r>
       <w:r>

</xml_diff>

<commit_message>
feat(cv): consolidate all UI/UX, Web, SEO and IT support into single master CV file
</commit_message>
<xml_diff>
--- a/Ho-So-Ung-Tuyen/CV-Le-Tran-Thanh-Uyen.docx
+++ b/Ho-So-Ung-Tuyen/CV-Le-Tran-Thanh-Uyen.docx
@@ -48,7 +48,7 @@
                 <w:color w:val="22C55E"/>
                 <w:sz w:val="23"/>
               </w:rPr>
-              <w:t>WEB ADMINISTRATOR · WORDPRESS DEVELOPER · SEO SPECIALIST · GRAPHIC &amp; UI/UX</w:t>
+              <w:t>GRAPHIC &amp; UI/UX DESIGNER · WEB &amp; SEO SPECIALIST · IT SUPPORT</w:t>
             </w:r>
           </w:p>
           <w:p>
@@ -86,7 +86,7 @@
           <w:color w:val="0B2342"/>
           <w:sz w:val="27"/>
         </w:rPr>
-        <w:t>■  GIỚI THIỆU BẢN THÂN (ABOUT ME)</w:t>
+        <w:t>■  TÓM TẮT CHUYÊN MÔN (PROFESSIONAL SUMMARY)</w:t>
       </w:r>
     </w:p>
     <w:tbl>
@@ -128,7 +128,7 @@
                 <w:color w:val="0B2342"/>
                 <w:sz w:val="22"/>
               </w:rPr>
-              <w:t xml:space="preserve">Hồ sơ năng lực: </w:t>
+              <w:t xml:space="preserve">Hồ sơ năng lực tổng hợp: </w:t>
             </w:r>
             <w:r>
               <w:rPr>
@@ -136,7 +136,7 @@
                 <w:color w:val="1F2937"/>
                 <w:sz w:val="22"/>
               </w:rPr>
-              <w:t>Hơn 3 năm kinh nghiệm thực tế trong phát triển website WordPress, quản trị hạ tầng web, triển khai SEO On-page/Technical và thiết kế đồ họa / giao diện UI/UX. Khả năng tự chủ trọn vẹn từ khâu phác thảo ý tưởng thiết kế đồ họa (Photoshop, Illustrator, Figma), dựng mã nguồn website chuẩn Responsive đến tối ưu hóa thứ hạng công cụ tìm kiếm và đo lường chuyển đổi thực tế.</w:t>
+              <w:t>Chuyên viên Graphic &amp; Web UI/UX Specialist / Web &amp; SEO (Tốt nghiệp chuyên ngành CNTT, hơn 3 năm kinh nghiệm thực chiến) có tư duy thẩm mỹ cao, thấu hiểu hành vi người dùng và năng lực phát triển trọn vẹn từ ý tưởng đến thành phẩm UX: Storyboard, Wireframe, Sitemaps, Flowcharts, Mockups, Prototype và Design System trên cả 3 nền tảng Desktop, Mobile và Tablet. Sở hữu lợi thế vượt trội về lập trình mã nguồn (HTML/CSS/JS, WordPress), SEO và hiệu năng giao diện; có khả năng làm việc độc lập từ A-Z dựng chạy các hệ thống web phức tạp, phối hợp nhịp nhàng cùng R&amp;D, Marketing, Dev, QA; đồng thời đáp ứng trọn vẹn kinh nghiệm ưu tiên về cài đặt phần mềm, sửa chữa phần cứng và quản lý thiết bị IT.</w:t>
             </w:r>
           </w:p>
         </w:tc>
@@ -249,7 +249,7 @@
           <w:color w:val="1F2937"/>
           <w:sz w:val="22"/>
         </w:rPr>
-        <w:t>Lắp ráp phần cứng PC/Laptop (Mainboard, CPU, RAM, SSD, VGA, Nguồn PSU); cài đặt hệ điều hành và phần mềm chuyên dụng (Adobe, Office, Dev tools); chuẩn đoán xử lý sự cố phần cứng/phần mềm; thiết lập mạng LAN/Wi-Fi và quản lý trang thiết bị văn phòng.</w:t>
+        <w:t>Lắp ráp phần cứng PC/Laptop (Mainboard, CPU, RAM, SSD, VGA, Nguồn PSU); cài đặt hệ điều hành (Windows, macOS, Linux) và phần mềm chuyên dụng (Adobe, Office, Dev tools); chuẩn đoán xử lý sự cố phần cứng/phần mềm; thiết lập mạng LAN/Wi-Fi và quản lý trang thiết bị văn phòng.</w:t>
       </w:r>
     </w:p>
     <w:p>
@@ -469,7 +469,7 @@
           <w:color w:val="0B2342"/>
           <w:sz w:val="27"/>
         </w:rPr>
-        <w:t>■  DỰ ÁN TIÊU BIỂU ĐÃ TRIỂN KHAI (FEATURED PROJECTS)</w:t>
+        <w:t>■  DỰ ÁN TIÊU BIỂU ĐÃ TRIỂN KHAI (8 HỆ THỐNG WEBSITE THỰC TẾ)</w:t>
       </w:r>
     </w:p>
     <w:p>
@@ -631,6 +631,116 @@
           <w:sz w:val="22"/>
         </w:rPr>
         <w:t>Website thương mại chậu đá tự nhiên: hình ảnh nén WebP sắc nét, Product Schema chuẩn Google Merchant, tốc độ tải trang dưới 1.8s.</w:t>
+      </w:r>
+    </w:p>
+    <w:p>
+      <w:pPr>
+        <w:pStyle w:val="ListBullet"/>
+        <w:spacing w:before="40" w:after="60" w:line="288" w:lineRule="auto"/>
+      </w:pPr>
+      <w:r>
+        <w:rPr>
+          <w:rFonts w:ascii="Arial" w:hAnsi="Arial"/>
+          <w:b/>
+          <w:color w:val="1F2937"/>
+          <w:sz w:val="22"/>
+        </w:rPr>
+        <w:t xml:space="preserve">Review Làm Đẹp &amp; Đánh Giá Thẩm Mỹ (review-lamdep.com · danhgiathammy.com): </w:t>
+      </w:r>
+      <w:r>
+        <w:rPr>
+          <w:rFonts w:ascii="Arial" w:hAnsi="Arial"/>
+          <w:color w:val="1F2937"/>
+          <w:sz w:val="22"/>
+        </w:rPr>
+        <w:t>Cặp đôi website tạp chí &amp; diễn đàn thẩm mỹ tự code WordPress theme từ đầu: kiến trúc Topic Cluster, Review Schema, cấu hình hạ tầng cPanel bảo mật cao và chống spam bot.</w:t>
+      </w:r>
+    </w:p>
+    <w:p>
+      <w:pPr>
+        <w:keepNext/>
+        <w:spacing w:before="280" w:after="80"/>
+        <w:pBdr>
+          <w:bottom w:val="single" w:sz="8" w:space="4" w:color="22C55E"/>
+        </w:pBdr>
+      </w:pPr>
+      <w:r>
+        <w:rPr>
+          <w:rFonts w:ascii="Arial" w:hAnsi="Arial"/>
+          <w:b/>
+          <w:color w:val="0B2342"/>
+          <w:sz w:val="27"/>
+        </w:rPr>
+        <w:t>■  ĐÀO TẠO, CHỨNG CHỈ &amp; KỸ NĂNG BỔ TRỢ (EDUCATION &amp; CERTIFICATIONS)</w:t>
+      </w:r>
+    </w:p>
+    <w:p>
+      <w:pPr>
+        <w:pStyle w:val="ListBullet"/>
+        <w:spacing w:before="40" w:after="60" w:line="288" w:lineRule="auto"/>
+      </w:pPr>
+      <w:r>
+        <w:rPr>
+          <w:rFonts w:ascii="Arial" w:hAnsi="Arial"/>
+          <w:b/>
+          <w:color w:val="1F2937"/>
+          <w:sz w:val="22"/>
+        </w:rPr>
+        <w:t xml:space="preserve">Đào Tạo Chuyên Ngành: </w:t>
+      </w:r>
+      <w:r>
+        <w:rPr>
+          <w:rFonts w:ascii="Arial" w:hAnsi="Arial"/>
+          <w:color w:val="1F2937"/>
+          <w:sz w:val="22"/>
+        </w:rPr>
+        <w:t>Công nghệ Thông tin (CNTT) - Nền tảng vững chắc về lắp ráp cài đặt máy tính, xử lý sự cố phần cứng, mạng nội bộ (LAN/Wi-Fi), cơ sở dữ liệu MySQL và kiến trúc web hiện đại.</w:t>
+      </w:r>
+    </w:p>
+    <w:p>
+      <w:pPr>
+        <w:pStyle w:val="ListBullet"/>
+        <w:spacing w:before="40" w:after="60" w:line="288" w:lineRule="auto"/>
+      </w:pPr>
+      <w:r>
+        <w:rPr>
+          <w:rFonts w:ascii="Arial" w:hAnsi="Arial"/>
+          <w:b/>
+          <w:color w:val="1F2937"/>
+          <w:sz w:val="22"/>
+        </w:rPr>
+        <w:t xml:space="preserve">Chứng Chỉ Chuyên Môn: </w:t>
+      </w:r>
+      <w:r>
+        <w:rPr>
+          <w:rFonts w:ascii="Arial" w:hAnsi="Arial"/>
+          <w:color w:val="1F2937"/>
+          <w:sz w:val="22"/>
+        </w:rPr>
+        <w:t>Google Analytics 4 (GA4), Technical SEO &amp; Search Console, Quản trị IT / cPanel / VPS, UI/UX Web Design &amp; Adobe Photoshop, Illustrator.</w:t>
+      </w:r>
+    </w:p>
+    <w:p>
+      <w:pPr>
+        <w:pStyle w:val="ListBullet"/>
+        <w:spacing w:before="40" w:after="60" w:line="288" w:lineRule="auto"/>
+      </w:pPr>
+      <w:r>
+        <w:rPr>
+          <w:rFonts w:ascii="Arial" w:hAnsi="Arial"/>
+          <w:b/>
+          <w:color w:val="1F2937"/>
+          <w:sz w:val="22"/>
+        </w:rPr>
+        <w:t xml:space="preserve">Tác Phong &amp; Cam Kết: </w:t>
+      </w:r>
+      <w:r>
+        <w:rPr>
+          <w:rFonts w:ascii="Arial" w:hAnsi="Arial"/>
+          <w:color w:val="1F2937"/>
+          <w:sz w:val="22"/>
+        </w:rPr>
+        <w:t>Khả năng độc lập xử lý sự cố (Troubleshooting PC/Server/Network), làm việc nhóm hiệu quả cùng R&amp;D/Marketing/Dev/QA, tinh thần học hỏi và trách nhiệm cao.</w:t>
       </w:r>
     </w:p>
     <w:sectPr>

</xml_diff>

<commit_message>
feat(seo): optimize all CV profiles to fully satisfy Senior SEO Specialist JD
</commit_message>
<xml_diff>
--- a/Ho-So-Ung-Tuyen/CV-Le-Tran-Thanh-Uyen.docx
+++ b/Ho-So-Ung-Tuyen/CV-Le-Tran-Thanh-Uyen.docx
@@ -48,7 +48,7 @@
                 <w:color w:val="22C55E"/>
                 <w:sz w:val="23"/>
               </w:rPr>
-              <w:t>GRAPHIC &amp; UI/UX DESIGNER · WEB &amp; SEO SPECIALIST · IT SUPPORT</w:t>
+              <w:t>SENIOR SEO SPECIALIST · WEB ADMINISTRATOR · GRAPHIC &amp; UI/UX</w:t>
             </w:r>
           </w:p>
           <w:p>
@@ -136,7 +136,7 @@
                 <w:color w:val="1F2937"/>
                 <w:sz w:val="22"/>
               </w:rPr>
-              <w:t>Chuyên viên Graphic &amp; Web UI/UX Specialist / Web &amp; SEO (Tốt nghiệp chuyên ngành CNTT, hơn 3 năm kinh nghiệm thực chiến) có tư duy thẩm mỹ tốt, sáng tạo và thấu hiểu hành vi người dùng; xây dựng giao diện UI/UX trực quan, gia tăng tính thẩm mỹ cho website và nội dung số trên cả 3 nền tảng Desktop, Mobile và Tablet. Sở hữu lợi thế vượt trội về lập trình mã nguồn (HTML/CSS/JS, WordPress), SEO và hiệu năng giao diện; có khả năng làm việc độc lập từ A-Z dựng chạy các hệ thống web phức tạp, phối hợp nhịp nhàng cùng R&amp;D, Marketing, Dev, QA; đồng thời đáp ứng trọn vẹn kinh nghiệm ưu tiên về cài đặt phần mềm, sửa chữa phần cứng và quản lý thiết bị IT.</w:t>
+              <w:t>Chuyên viên Senior SEO Specialist &amp; Web Administrator (Tốt nghiệp chuyên ngành CNTT, hơn 5 năm kinh nghiệm thực chiến từ 2017 đến nay) thành thạo toàn diện On-page, Off-page và Technical SEO. Năng lực nghiên cứu &amp; phân tích từ khóa chuyên sâu (Google Keyword Planner, Ahrefs, Semrush), phân tích đối thủ cạnh tranh, tối ưu cấu trúc website, meta tags, headings, internal linking và UX/UI giữ chân người dùng. Chuyên gia Technical SEO (đảm bảo crawlability, indexability, tốc độ Core Web Vitals, Schema JSON-LD, XML sitemaps, robots.txt, kiểm toán Screaming Frog); xây dựng chiến lược Off-page an toàn (Guest Post, Brand Mentions, White-Hat link building). Phối hợp chặt chẽ cùng đội ngũ Content Marketing, cập nhật liên tục thuật toán Google và lập báo cáo định kỳ qua GA4, Search Console. Đồng thời sở hữu thế mạnh vượt trội về lập trình mã nguồn (HTML/CSS/JS, WordPress), làm việc độc lập A-Z và đáp ứng kinh nghiệm ưu tiên về IT Support &amp; phần cứng.</w:t>
             </w:r>
           </w:p>
         </w:tc>
@@ -172,7 +172,7 @@
           <w:color w:val="1F2937"/>
           <w:sz w:val="22"/>
         </w:rPr>
-        <w:t xml:space="preserve">UI/UX &amp; Graphic Design: </w:t>
+        <w:t xml:space="preserve">SEO Chuyên Sâu, Analytics &amp; Hiệu Suất (Đáp Ứng 100% Yêu Cầu Tuyển Dụng): </w:t>
       </w:r>
       <w:r>
         <w:rPr>
@@ -180,7 +180,7 @@
           <w:color w:val="1F2937"/>
           <w:sz w:val="22"/>
         </w:rPr>
-        <w:t>Thiết kế giao diện người dùng (UI) trực quan, hiện đại, gia tăng tính thẩm mỹ cho website, phần mềm và ứng dụng; thiết kế responsive tối ưu trên cả 3 nền tảng Desktop, Mobile và Tablet; thành thạo Adobe Photoshop, Illustrator, Figma; khảo sát hành vi người dùng, tiếp nhận phản hồi và tối ưu trải nghiệm người dùng hiệu quả.</w:t>
+        <w:t>Nghiên cứu &amp; phân tích từ khóa chuyên sâu (Ahrefs, Semrush, Google Keyword Planner); phân tích đối thủ cạnh tranh xác định Keyword Gap; tối ưu On-page (cấu trúc web, meta tags, headings H1-H3, internal links, UX/UI hỗ trợ SEO); Technical SEO (đảm bảo crawlability, 100% indexability, cấu hình Schema JSON-LD, XML sitemaps, robots.txt, kiểm toán lỗi Screaming Frog); xây dựng Off-page an toàn (Guest Post, Brand Mentions, White-Hat link building); phối hợp đội ngũ Content phát triển nội dung chuẩn SEO; giám sát, đo lường và lập báo cáo định kỳ qua Google Analytics 4 (GA4), Google Search Console; cập nhật liên tục các thuật toán cốt lõi mới nhất của Google; tối ưu Core Web Vitals chuẩn xanh (LCP &lt; 2s, CLS &lt; 0.1); thành thạo Rank Math, Yoast SEO.</w:t>
       </w:r>
     </w:p>
     <w:p>
@@ -218,7 +218,7 @@
           <w:color w:val="1F2937"/>
           <w:sz w:val="22"/>
         </w:rPr>
-        <w:t xml:space="preserve">SEO Website &amp; Hiệu Suất Giao Diện: </w:t>
+        <w:t xml:space="preserve">UI/UX &amp; Graphic Design: </w:t>
       </w:r>
       <w:r>
         <w:rPr>
@@ -226,7 +226,7 @@
           <w:color w:val="1F2937"/>
           <w:sz w:val="22"/>
         </w:rPr>
-        <w:t>Technical SEO, Schema JSON-LD, Topic Cluster, kiểm toán Screaming Frog, Core Web Vitals chuẩn xanh (LCP &lt; 2s, CLS &lt; 0.1), Google Search Console, Google Analytics 4, Rank Math.</w:t>
+        <w:t>Thiết kế giao diện người dùng (UI) trực quan, hiện đại, gia tăng tính thẩm mỹ cho website, phần mềm và ứng dụng; thiết kế responsive tối ưu trên cả 3 nền tảng Desktop, Mobile và Tablet; thành thạo Adobe Photoshop, Illustrator, Figma; khảo sát hành vi người dùng, tiếp nhận phản hồi và tối ưu trải nghiệm người dùng hiệu quả.</w:t>
       </w:r>
     </w:p>
     <w:p>

</xml_diff>

<commit_message>
feat(cv): highlight detailed career positions held across all CV and web documents
</commit_message>
<xml_diff>
--- a/Ho-So-Ung-Tuyen/CV-Le-Tran-Thanh-Uyen.docx
+++ b/Ho-So-Ung-Tuyen/CV-Le-Tran-Thanh-Uyen.docx
@@ -267,9 +267,70 @@
           <w:color w:val="0B2342"/>
           <w:sz w:val="27"/>
         </w:rPr>
-        <w:t>■  KINH NGHIỆM LÀM VIỆC (WORK EXPERIENCE)</w:t>
+        <w:t>■  KINH NGHIỆM LÀM VIỆC &amp; CÁC VỊ TRÍ ĐÃ ĐẢM NHIỆM (WORK EXPERIENCE &amp; POSITIONS HELD)</w:t>
       </w:r>
     </w:p>
+    <w:tbl>
+      <w:tblPr>
+        <w:tblW w:type="auto" w:w="0"/>
+        <w:jc w:val="center"/>
+        <w:tblLayout w:type="fixed"/>
+        <w:tblLook w:firstColumn="1" w:firstRow="1" w:lastColumn="0" w:lastRow="0" w:noHBand="0" w:noVBand="1" w:val="04A0"/>
+      </w:tblPr>
+      <w:tblGrid>
+        <w:gridCol w:w="9749"/>
+      </w:tblGrid>
+      <w:tr>
+        <w:tc>
+          <w:tcPr>
+            <w:tcW w:type="dxa" w:w="9792"/>
+            <w:shd w:fill="F8FAFC"/>
+            <w:tcMar>
+              <w:top w:w="140" w:type="dxa"/>
+              <w:bottom w:w="140" w:type="dxa"/>
+              <w:left w:w="180" w:type="dxa"/>
+              <w:right w:w="180" w:type="dxa"/>
+            </w:tcMar>
+            <w:tcBorders>
+              <w:left w:val="single" w:sz="24" w:space="0" w:color="0284C7"/>
+              <w:top w:val="none"/>
+              <w:right w:val="none"/>
+              <w:bottom w:val="none"/>
+            </w:tcBorders>
+          </w:tcPr>
+          <w:p>
+            <w:pPr>
+              <w:spacing w:before="40" w:after="40" w:line="300" w:lineRule="auto"/>
+            </w:pPr>
+            <w:r>
+              <w:rPr>
+                <w:rFonts w:ascii="Arial" w:hAnsi="Arial"/>
+                <w:b/>
+                <w:color w:val="0B2342"/>
+                <w:sz w:val="22"/>
+              </w:rPr>
+              <w:t xml:space="preserve">Tổng hợp các vị trí chuyên môn đã từng làm: </w:t>
+            </w:r>
+            <w:r>
+              <w:rPr>
+                <w:rFonts w:ascii="Arial" w:hAnsi="Arial"/>
+                <w:color w:val="1F2937"/>
+                <w:sz w:val="22"/>
+              </w:rPr>
+              <w:t>1. Senior SEO Specialist (5+ năm: 2017 – Hiện tại)</w:t>
+              <w:br/>
+              <w:t>2. Website Administrator / Quản trị Hệ thống (5+ năm: 2017 – Hiện tại)</w:t>
+              <w:br/>
+              <w:t>3. WordPress Developer / Lập trình viên Web (3+ năm: 2022 – Hiện tại)</w:t>
+              <w:br/>
+              <w:t>4. Graphic &amp; Web UI/UX Designer (3+ năm: 2021 – Hiện tại)</w:t>
+              <w:br/>
+              <w:t>5. IT Support &amp; Kỹ thuật viên Phần cứng PC (Xuyên suốt các giai đoạn)</w:t>
+            </w:r>
+          </w:p>
+        </w:tc>
+      </w:tr>
+    </w:tbl>
     <w:p>
       <w:pPr>
         <w:spacing w:before="160" w:after="40"/>
@@ -281,7 +342,7 @@
           <w:color w:val="0B2342"/>
           <w:sz w:val="24"/>
         </w:rPr>
-        <w:t>Web Administrator, SEO Specialist &amp; Designer | Tự do &amp; Doanh nghiệp</w:t>
+        <w:t>1. Vị trí: Senior SEO Specialist &amp; Website Administrator | Cụm Website Thẩm mỹ &amp; Cổng Đánh giá (TP.HCM)</w:t>
       </w:r>
       <w:r>
         <w:rPr>
@@ -290,7 +351,7 @@
           <w:color w:val="4B5563"/>
           <w:sz w:val="22"/>
         </w:rPr>
-        <w:t xml:space="preserve">   (2022 – Hiện tại)</w:t>
+        <w:t xml:space="preserve">   (2024 – Hiện tại)</w:t>
       </w:r>
     </w:p>
     <w:p>
@@ -305,7 +366,7 @@
           <w:color w:val="1F2937"/>
           <w:sz w:val="22"/>
         </w:rPr>
-        <w:t xml:space="preserve">Phát triển công cụ &amp; Tối ưu SEO: </w:t>
+        <w:t xml:space="preserve">Nghiên cứu từ khóa &amp; Phân tích đối thủ: </w:t>
       </w:r>
       <w:r>
         <w:rPr>
@@ -313,7 +374,7 @@
           <w:color w:val="1F2937"/>
           <w:sz w:val="22"/>
         </w:rPr>
-        <w:t>Tự lập trình WordPress Plugin tối ưu Content SEO (chấm điểm on-page theo thời gian thực, tự sinh mục lục TOC và chèn Schema FAQ), giúp chuẩn hóa 100% bài viết và đưa hơn 30+ từ khóa vào Top 5 Google.</w:t>
+        <w:t>Sử dụng Ahrefs, Semrush, Google Keyword Planner phân tích ma trận từ khóa và khoảng trống từ khóa (Keyword Gap) của đối thủ để mở rộng lưu lượng truy cập.</w:t>
       </w:r>
     </w:p>
     <w:p>
@@ -328,7 +389,7 @@
           <w:color w:val="1F2937"/>
           <w:sz w:val="22"/>
         </w:rPr>
-        <w:t xml:space="preserve">Triển khai &amp; Vận hành Web WordPress, Laravel &amp; Blogspot: </w:t>
+        <w:t xml:space="preserve">Tối ưu On-page &amp; Phối hợp Content: </w:t>
       </w:r>
       <w:r>
         <w:rPr>
@@ -336,7 +397,7 @@
           <w:color w:val="1F2937"/>
           <w:sz w:val="22"/>
         </w:rPr>
-        <w:t>Xây dựng và quản trị các website doanh nghiệp trên WordPress tự code theme, cổng danh bạ trên Laravel MVC (santhammy.com), website thương mại điện tử tự code WordPress theme từ đầu (smartphone.taichinhtaithanh.com) và Landing Page tư vấn tài chính trên Google Blogspot (taichinhtaithanh.com). Tối ưu tốc độ tải trang đạt điểm số 90+ trên Google PageSpeed Insights.</w:t>
+        <w:t>Tối ưu cấu trúc web, meta title/desc, heading H1-H3, internal link Topic Cluster; phối hợp cùng Content Marketing xây dựng bài viết chuẩn SEO, hấp dẫn; tự lập trình WordPress Plugin chấm điểm SEO theo thời gian thực.</w:t>
       </w:r>
     </w:p>
     <w:p>
@@ -351,7 +412,7 @@
           <w:color w:val="1F2937"/>
           <w:sz w:val="22"/>
         </w:rPr>
-        <w:t xml:space="preserve">Thực hiện Chiến dịch SEO: </w:t>
+        <w:t xml:space="preserve">Kiểm toán Technical SEO &amp; Hạ tầng: </w:t>
       </w:r>
       <w:r>
         <w:rPr>
@@ -359,7 +420,7 @@
           <w:color w:val="1F2937"/>
           <w:sz w:val="22"/>
         </w:rPr>
-        <w:t>Lên kế hoạch bộ từ khóa, tối ưu On-page và Technical SEO, giúp website tăng trưởng lượng truy cập tự nhiên hơn 180% và đưa hơn 30+ từ khóa vào Top 5 Google.</w:t>
+        <w:t>Đảm bảo crawlability, 100% indexability, cấu hình Schema JSON-LD (MedicalBusiness, Review, FAQ), sitemaps, robots.txt, xử lý lỗi crawl Screaming Frog; tối ưu Core Web Vitals xanh (LCP &lt; 2s).</w:t>
       </w:r>
     </w:p>
     <w:p>
@@ -374,7 +435,7 @@
           <w:color w:val="1F2937"/>
           <w:sz w:val="22"/>
         </w:rPr>
-        <w:t xml:space="preserve">Thiết kế Đồ họa &amp; Nhận diện: </w:t>
+        <w:t xml:space="preserve">Off-page &amp; Đo lường Báo cáo: </w:t>
       </w:r>
       <w:r>
         <w:rPr>
@@ -382,7 +443,7 @@
           <w:color w:val="1F2937"/>
           <w:sz w:val="22"/>
         </w:rPr>
-        <w:t>Thiết kế toàn bộ banner trang chủ, hình ảnh bài viết và ấn phẩm truyền thông mạng xã hội bằng Photoshop và Illustrator.</w:t>
+        <w:t>Triển khai Guest Post chất lượng, Brand Mentions và White-Hat link building an toàn; theo dõi GA4, Search Console, cập nhật thuật toán Google và lập báo cáo định kỳ.</w:t>
       </w:r>
     </w:p>
     <w:p>
@@ -396,7 +457,145 @@
           <w:color w:val="0B2342"/>
           <w:sz w:val="24"/>
         </w:rPr>
-        <w:t>Senior SEO Specialist &amp; Industrial Web Administrator | Cụm Doanh Nghiệp Cơ Khí Thới An &amp; Cân Hoàng Thiên</w:t>
+        <w:t>2. Vị trí: WordPress Developer &amp; E-commerce Operations | Dự án Stone Sinks Vietnam (Chậu đá tự nhiên)</w:t>
+      </w:r>
+      <w:r>
+        <w:rPr>
+          <w:rFonts w:ascii="Arial" w:hAnsi="Arial"/>
+          <w:i/>
+          <w:color w:val="4B5563"/>
+          <w:sz w:val="22"/>
+        </w:rPr>
+        <w:t xml:space="preserve">   (2023 – 2024)</w:t>
+      </w:r>
+    </w:p>
+    <w:p>
+      <w:pPr>
+        <w:pStyle w:val="ListBullet"/>
+        <w:spacing w:before="40" w:after="60" w:line="288" w:lineRule="auto"/>
+      </w:pPr>
+      <w:r>
+        <w:rPr>
+          <w:rFonts w:ascii="Arial" w:hAnsi="Arial"/>
+          <w:b/>
+          <w:color w:val="1F2937"/>
+          <w:sz w:val="22"/>
+        </w:rPr>
+        <w:t xml:space="preserve">Phát triển E-commerce &amp; Giao diện Responsive: </w:t>
+      </w:r>
+      <w:r>
+        <w:rPr>
+          <w:rFonts w:ascii="Arial" w:hAnsi="Arial"/>
+          <w:color w:val="1F2937"/>
+          <w:sz w:val="22"/>
+        </w:rPr>
+        <w:t>Tùy biến Child Theme, thiết lập WooCommerce, xây dựng bộ lọc sản phẩm đa thuộc tính theo chất liệu và màu sắc, tối ưu luồng đặt hàng và liên hệ báo giá.</w:t>
+      </w:r>
+    </w:p>
+    <w:p>
+      <w:pPr>
+        <w:pStyle w:val="ListBullet"/>
+        <w:spacing w:before="40" w:after="60" w:line="288" w:lineRule="auto"/>
+      </w:pPr>
+      <w:r>
+        <w:rPr>
+          <w:rFonts w:ascii="Arial" w:hAnsi="Arial"/>
+          <w:b/>
+          <w:color w:val="1F2937"/>
+          <w:sz w:val="22"/>
+        </w:rPr>
+        <w:t xml:space="preserve">Đồ họa &amp; On-page SEO sản phẩm: </w:t>
+      </w:r>
+      <w:r>
+        <w:rPr>
+          <w:rFonts w:ascii="Arial" w:hAnsi="Arial"/>
+          <w:color w:val="1F2937"/>
+          <w:sz w:val="22"/>
+        </w:rPr>
+        <w:t>Thiết kế banner chương trình, retouch ảnh sản phẩm bằng Photoshop và nén WebP; khai báo Schema Product đầy đủ đưa từ khóa sản phẩm lên top Google.</w:t>
+      </w:r>
+    </w:p>
+    <w:p>
+      <w:pPr>
+        <w:spacing w:before="200" w:after="40"/>
+      </w:pPr>
+      <w:r>
+        <w:rPr>
+          <w:rFonts w:ascii="Arial" w:hAnsi="Arial"/>
+          <w:b/>
+          <w:color w:val="0B2342"/>
+          <w:sz w:val="24"/>
+        </w:rPr>
+        <w:t>3. Vị trí: WordPress Developer (Tự Code Theme) &amp; UI/UX Designer | Smartphone E-commerce &amp; Tài Chính Tài Thành</w:t>
+      </w:r>
+      <w:r>
+        <w:rPr>
+          <w:rFonts w:ascii="Arial" w:hAnsi="Arial"/>
+          <w:i/>
+          <w:color w:val="4B5563"/>
+          <w:sz w:val="22"/>
+        </w:rPr>
+        <w:t xml:space="preserve">   (2022 – 2023)</w:t>
+      </w:r>
+    </w:p>
+    <w:p>
+      <w:pPr>
+        <w:pStyle w:val="ListBullet"/>
+        <w:spacing w:before="40" w:after="60" w:line="288" w:lineRule="auto"/>
+      </w:pPr>
+      <w:r>
+        <w:rPr>
+          <w:rFonts w:ascii="Arial" w:hAnsi="Arial"/>
+          <w:b/>
+          <w:color w:val="1F2937"/>
+          <w:sz w:val="22"/>
+        </w:rPr>
+        <w:t xml:space="preserve">Tự lập trình Custom Theme WordPress từ đầu: </w:t>
+      </w:r>
+      <w:r>
+        <w:rPr>
+          <w:rFonts w:ascii="Arial" w:hAnsi="Arial"/>
+          <w:color w:val="1F2937"/>
+          <w:sz w:val="22"/>
+        </w:rPr>
+        <w:t>Tự code theme WordPress sạch 100% không dùng theme dựng sẵn, tích hợp WooCommerce, bộ lọc thông số/màu sắc/dung lượng, tối ưu Core Web Vitals đạt PageSpeed 90+.</w:t>
+      </w:r>
+    </w:p>
+    <w:p>
+      <w:pPr>
+        <w:pStyle w:val="ListBullet"/>
+        <w:spacing w:before="40" w:after="60" w:line="288" w:lineRule="auto"/>
+      </w:pPr>
+      <w:r>
+        <w:rPr>
+          <w:rFonts w:ascii="Arial" w:hAnsi="Arial"/>
+          <w:b/>
+          <w:color w:val="1F2937"/>
+          <w:sz w:val="22"/>
+        </w:rPr>
+        <w:t xml:space="preserve">Thiết kế Landing Page Blogspot &amp; CRO: </w:t>
+      </w:r>
+      <w:r>
+        <w:rPr>
+          <w:rFonts w:ascii="Arial" w:hAnsi="Arial"/>
+          <w:color w:val="1F2937"/>
+          <w:sz w:val="22"/>
+        </w:rPr>
+        <w:t>Xây dựng Landing Page tư vấn tài chính taichinhtaithanh.com trên nền tảng Google Blogspot với công cụ tính khoản vay tương tác, form đăng ký tối ưu CRO.</w:t>
+      </w:r>
+    </w:p>
+    <w:p>
+      <w:pPr>
+        <w:spacing w:before="200" w:after="40"/>
+      </w:pPr>
+      <w:r>
+        <w:rPr>
+          <w:rFonts w:ascii="Arial" w:hAnsi="Arial"/>
+          <w:b/>
+          <w:color w:val="0B2342"/>
+          <w:sz w:val="24"/>
+        </w:rPr>
+        <w:t>4. Vị trí: Senior SEO Specialist &amp; Industrial Web Administrator | Cụm Doanh Nghiệp Cơ Khí Thới An &amp; Cân Hoàng Thiên</w:t>
       </w:r>
       <w:r>
         <w:rPr>
@@ -452,6 +651,43 @@
           <w:sz w:val="22"/>
         </w:rPr>
         <w:t>Tối ưu hóa Google Business Profile tại Quận 12 phủ sóng tiếp cận khách hàng doanh nghiệp tại TP.HCM và các KCN phía Nam; thiết kế trọn bộ catalogue thông số kỹ thuật (Spec Sheets) bằng Photoshop và Illustrator; vận hành cPanel bền vững.</w:t>
+      </w:r>
+    </w:p>
+    <w:p>
+      <w:pPr>
+        <w:spacing w:before="200" w:after="40"/>
+      </w:pPr>
+      <w:r>
+        <w:rPr>
+          <w:rFonts w:ascii="Arial" w:hAnsi="Arial"/>
+          <w:b/>
+          <w:color w:val="0B2342"/>
+          <w:sz w:val="24"/>
+        </w:rPr>
+        <w:t>5. Vị trí Kiêm nhiệm: IT Support &amp; Kỹ Thuật Viên Phần Cứng PC / Mạng Văn Phòng | Xuyên suốt các giai đoạn</w:t>
+      </w:r>
+    </w:p>
+    <w:p>
+      <w:pPr>
+        <w:pStyle w:val="ListBullet"/>
+        <w:spacing w:before="40" w:after="60" w:line="288" w:lineRule="auto"/>
+      </w:pPr>
+      <w:r>
+        <w:rPr>
+          <w:rFonts w:ascii="Arial" w:hAnsi="Arial"/>
+          <w:b/>
+          <w:color w:val="1F2937"/>
+          <w:sz w:val="22"/>
+        </w:rPr>
+        <w:t xml:space="preserve">Lắp ráp, Cài đặt &amp; Quản lý thiết bị: </w:t>
+      </w:r>
+      <w:r>
+        <w:rPr>
+          <w:rFonts w:ascii="Arial" w:hAnsi="Arial"/>
+          <w:color w:val="1F2937"/>
+          <w:sz w:val="22"/>
+        </w:rPr>
+        <w:t>Trực tiếp lắp ráp phần cứng PC/Laptop (Mainboard, CPU, RAM, SSD, VGA, Nguồn PSU); cài đặt hệ điều hành (Windows, macOS, Linux) và phần mềm chuyên dụng; chuẩn đoán và xử lý sự cố phần cứng/phần mềm; thiết lập mạng nội bộ LAN/Wi-Fi và bảo trì trang thiết bị văn phòng.</w:t>
       </w:r>
     </w:p>
     <w:p>

</xml_diff>

<commit_message>
feat(cv): supplement detailed work experiences and IT support position across all documents
</commit_message>
<xml_diff>
--- a/Ho-So-Ung-Tuyen/CV-Le-Tran-Thanh-Uyen.docx
+++ b/Ho-So-Ung-Tuyen/CV-Le-Tran-Thanh-Uyen.docx
@@ -489,7 +489,7 @@
           <w:color w:val="1F2937"/>
           <w:sz w:val="22"/>
         </w:rPr>
-        <w:t>Tùy biến Child Theme, thiết lập WooCommerce, xây dựng bộ lọc sản phẩm đa thuộc tính theo chất liệu và màu sắc, tối ưu luồng đặt hàng và liên hệ báo giá.</w:t>
+        <w:t>Tùy biến Child Theme, thiết lập WooCommerce, xây dựng bộ lọc sản phẩm đa thuộc tính theo chất liệu và màu sắc, tối ưu luồng đặt hàng và liên hệ báo giá trên Desktop, Mobile và Tablet.</w:t>
       </w:r>
     </w:p>
     <w:p>
@@ -504,7 +504,7 @@
           <w:color w:val="1F2937"/>
           <w:sz w:val="22"/>
         </w:rPr>
-        <w:t xml:space="preserve">Đồ họa &amp; On-page SEO sản phẩm: </w:t>
+        <w:t xml:space="preserve">Đồ họa, On-page SEO sản phẩm &amp; Tối ưu chuyển đổi: </w:t>
       </w:r>
       <w:r>
         <w:rPr>
@@ -512,7 +512,7 @@
           <w:color w:val="1F2937"/>
           <w:sz w:val="22"/>
         </w:rPr>
-        <w:t>Thiết kế banner chương trình, retouch ảnh sản phẩm bằng Photoshop và nén WebP; khai báo Schema Product đầy đủ đưa từ khóa sản phẩm lên top Google.</w:t>
+        <w:t>Thiết kế banner chương trình, retouch ảnh sản phẩm bằng Photoshop và nén WebP; khai báo Schema Product đầy đủ đưa từ khóa sản phẩm lên top Google; tiếp nhận phản hồi khách hàng để tối ưu trải nghiệm.</w:t>
       </w:r>
     </w:p>
     <w:p>
@@ -582,6 +582,29 @@
           <w:sz w:val="22"/>
         </w:rPr>
         <w:t>Xây dựng Landing Page tư vấn tài chính taichinhtaithanh.com trên nền tảng Google Blogspot với công cụ tính khoản vay tương tác, form đăng ký tối ưu CRO.</w:t>
+      </w:r>
+    </w:p>
+    <w:p>
+      <w:pPr>
+        <w:pStyle w:val="ListBullet"/>
+        <w:spacing w:before="40" w:after="60" w:line="288" w:lineRule="auto"/>
+      </w:pPr>
+      <w:r>
+        <w:rPr>
+          <w:rFonts w:ascii="Arial" w:hAnsi="Arial"/>
+          <w:b/>
+          <w:color w:val="1F2937"/>
+          <w:sz w:val="22"/>
+        </w:rPr>
+        <w:t xml:space="preserve">Thiết kế Đồ họa &amp; Nhận diện số: </w:t>
+      </w:r>
+      <w:r>
+        <w:rPr>
+          <w:rFonts w:ascii="Arial" w:hAnsi="Arial"/>
+          <w:color w:val="1F2937"/>
+          <w:sz w:val="22"/>
+        </w:rPr>
+        <w:t>Thiết kế trọn bộ banner flash sale, icon thông số kỹ thuật vector bằng Illustrator và Photoshop.</w:t>
       </w:r>
     </w:p>
     <w:p>
@@ -679,7 +702,7 @@
           <w:color w:val="1F2937"/>
           <w:sz w:val="22"/>
         </w:rPr>
-        <w:t xml:space="preserve">Lắp ráp, Cài đặt &amp; Quản lý thiết bị: </w:t>
+        <w:t xml:space="preserve">Lắp ráp &amp; Cài đặt Phần cứng PC / Laptop: </w:t>
       </w:r>
       <w:r>
         <w:rPr>
@@ -687,7 +710,53 @@
           <w:color w:val="1F2937"/>
           <w:sz w:val="22"/>
         </w:rPr>
-        <w:t>Trực tiếp lắp ráp phần cứng PC/Laptop (Mainboard, CPU, RAM, SSD, VGA, Nguồn PSU); cài đặt hệ điều hành (Windows, macOS, Linux) và phần mềm chuyên dụng; chuẩn đoán và xử lý sự cố phần cứng/phần mềm; thiết lập mạng nội bộ LAN/Wi-Fi và bảo trì trang thiết bị văn phòng.</w:t>
+        <w:t>Trực tiếp tư vấn cấu hình, lắp ráp linh kiện PC/Laptop (Mainboard, CPU, RAM, SSD NVMe, card đồ họa VGA, nguồn PSU) tối ưu cho công việc thiết kế đồ họa và lập trình.</w:t>
+      </w:r>
+    </w:p>
+    <w:p>
+      <w:pPr>
+        <w:pStyle w:val="ListBullet"/>
+        <w:spacing w:before="40" w:after="60" w:line="288" w:lineRule="auto"/>
+      </w:pPr>
+      <w:r>
+        <w:rPr>
+          <w:rFonts w:ascii="Arial" w:hAnsi="Arial"/>
+          <w:b/>
+          <w:color w:val="1F2937"/>
+          <w:sz w:val="22"/>
+        </w:rPr>
+        <w:t xml:space="preserve">Cài đặt Hệ điều hành &amp; Phần mềm chuyên dụng: </w:t>
+      </w:r>
+      <w:r>
+        <w:rPr>
+          <w:rFonts w:ascii="Arial" w:hAnsi="Arial"/>
+          <w:color w:val="1F2937"/>
+          <w:sz w:val="22"/>
+        </w:rPr>
+        <w:t>Cài đặt hoàn chỉnh hệ điều hành (Windows 10/11, macOS, Ubuntu Linux), cài đặt trọn bộ phần mềm thiết kế Adobe (Photoshop, Illustrator) và công cụ lập trình (VS Code, Git, Docker, local servers).</w:t>
+      </w:r>
+    </w:p>
+    <w:p>
+      <w:pPr>
+        <w:pStyle w:val="ListBullet"/>
+        <w:spacing w:before="40" w:after="60" w:line="288" w:lineRule="auto"/>
+      </w:pPr>
+      <w:r>
+        <w:rPr>
+          <w:rFonts w:ascii="Arial" w:hAnsi="Arial"/>
+          <w:b/>
+          <w:color w:val="1F2937"/>
+          <w:sz w:val="22"/>
+        </w:rPr>
+        <w:t xml:space="preserve">Bảo trì, Xử lý sự cố &amp; Quản lý thiết bị: </w:t>
+      </w:r>
+      <w:r>
+        <w:rPr>
+          <w:rFonts w:ascii="Arial" w:hAnsi="Arial"/>
+          <w:color w:val="1F2937"/>
+          <w:sz w:val="22"/>
+        </w:rPr>
+        <w:t>Chuẩn đoán và xử lý nhanh chóng các sự cố phần cứng/phần mềm; thiết lập hệ thống mạng nội bộ LAN, cấu hình Router Wi-Fi văn phòng, chia sẻ máy in; quản lý cấp phát và bảo trì trang thiết bị kỹ thuật an toàn.</w:t>
       </w:r>
     </w:p>
     <w:p>

</xml_diff>

<commit_message>
feat(cv): highlight 4-in-1 multi-disciplinary skillset across web programming, SEO, image design, and IT hardware
</commit_message>
<xml_diff>
--- a/Ho-So-Ung-Tuyen/CV-Le-Tran-Thanh-Uyen.docx
+++ b/Ho-So-Ung-Tuyen/CV-Le-Tran-Thanh-Uyen.docx
@@ -48,7 +48,7 @@
                 <w:color w:val="22C55E"/>
                 <w:sz w:val="23"/>
               </w:rPr>
-              <w:t>SENIOR SEO SPECIALIST · WEB ADMINISTRATOR · GRAPHIC &amp; UI/UX</w:t>
+              <w:t>LẬP TRÌNH WEB · SENIOR SEO · THIẾT KẾ ĐỒ HỌA · IT PHẦN CỨNG PC</w:t>
             </w:r>
           </w:p>
           <w:p>
@@ -128,7 +128,7 @@
                 <w:color w:val="0B2342"/>
                 <w:sz w:val="22"/>
               </w:rPr>
-              <w:t xml:space="preserve">Hồ sơ năng lực tổng hợp: </w:t>
+              <w:t xml:space="preserve">Năng lực thực chiến đa nhiệm 4 trong 1: </w:t>
             </w:r>
             <w:r>
               <w:rPr>
@@ -136,7 +136,15 @@
                 <w:color w:val="1F2937"/>
                 <w:sz w:val="22"/>
               </w:rPr>
-              <w:t>Chuyên viên Senior SEO Specialist &amp; Web Administrator (Tốt nghiệp chuyên ngành CNTT, hơn 5 năm kinh nghiệm thực chiến từ 2017 đến nay) thành thạo toàn diện On-page, Off-page và Technical SEO. Năng lực nghiên cứu &amp; phân tích từ khóa chuyên sâu (Google Keyword Planner, Ahrefs, Semrush), phân tích đối thủ cạnh tranh, tối ưu cấu trúc website, meta tags, headings, internal linking và UX/UI giữ chân người dùng. Chuyên gia Technical SEO (đảm bảo crawlability, indexability, tốc độ Core Web Vitals, Schema JSON-LD, XML sitemaps, robots.txt, kiểm toán Screaming Frog); xây dựng chiến lược Off-page an toàn (Guest Post, Brand Mentions, White-Hat link building). Phối hợp chặt chẽ cùng đội ngũ Content Marketing, cập nhật liên tục thuật toán Google và lập báo cáo định kỳ qua GA4, Search Console. Đồng thời sở hữu thế mạnh vượt trội về lập trình mã nguồn (HTML/CSS/JS, WordPress), làm việc độc lập A-Z và đáp ứng kinh nghiệm ưu tiên về IT Support &amp; phần cứng.</w:t>
+              <w:t>Nhân sự công nghệ đa nhiệm sở hữu năng lực thực chiến toàn diện 4 trong 1:</w:t>
+              <w:br/>
+              <w:t>• Vừa trực tiếp Lập trình Web: WordPress Developer tự code custom theme sạch 100%, WooCommerce, HTML5/CSS3/JS, PHP/MySQL, đạt PageSpeed 90+.</w:t>
+              <w:br/>
+              <w:t>• Vừa triển khai SEO chuyên sâu: Senior SEO Specialist (5+ năm), On-page Topic Cluster, Off-page an toàn, Technical Audit Screaming Frog, Schema JSON-LD đa thực thể, đưa 150+ từ khóa lên Top 1–5 Google.</w:t>
+              <w:br/>
+              <w:t>• Vừa Thiết kế Đồ họa &amp; Hình ảnh: Banner quảng cáo, retouch ảnh sản phẩm nén WebP siêu nhẹ, catalogue B2B bằng Photoshop và Illustrator, thiết kế UI/UX Responsive trên cả 3 nền tảng.</w:t>
+              <w:br/>
+              <w:t>• Vừa đảm nhiệm IT Phần cứng PC: Tư vấn cấu hình, trực tiếp lắp ráp PC/Laptop, cài đặt hệ điều hành (Windows, macOS, Linux), trọn bộ phần mềm chuyên dụng Adobe/Dev, sửa chữa phần cứng và thiết lập mạng nội bộ LAN/Wi-Fi.</w:t>
             </w:r>
           </w:p>
         </w:tc>
@@ -309,7 +317,7 @@
                 <w:color w:val="0B2342"/>
                 <w:sz w:val="22"/>
               </w:rPr>
-              <w:t xml:space="preserve">Tổng hợp các vị trí chuyên môn đã từng làm: </w:t>
+              <w:t xml:space="preserve">Năng lực đảm nhiệm đồng thời (4 trong 1): </w:t>
             </w:r>
             <w:r>
               <w:rPr>
@@ -317,15 +325,13 @@
                 <w:color w:val="1F2937"/>
                 <w:sz w:val="22"/>
               </w:rPr>
-              <w:t>1. Senior SEO Specialist (5+ năm: 2017 – Hiện tại)</w:t>
+              <w:t>1. Lập trình Web: WordPress Developer tự code theme từ đầu, WooCommerce, tối ưu mã nguồn từ A-Z</w:t>
               <w:br/>
-              <w:t>2. Website Administrator / Quản trị Hệ thống (5+ năm: 2017 – Hiện tại)</w:t>
+              <w:t>2. Chuyên gia SEO: On-page, Off-page, Technical Audit, Schema JSON-LD, đưa 150+ từ khóa Top 1-5 Google</w:t>
               <w:br/>
-              <w:t>3. WordPress Developer / Lập trình viên Web (3+ năm: 2022 – Hiện tại)</w:t>
+              <w:t>3. Thiết kế Đồ họa &amp; Ảnh: Banner, retouch ảnh sản phẩm, WebP, catalogue B2B bằng Photoshop &amp; Illustrator, UI/UX</w:t>
               <w:br/>
-              <w:t>4. Graphic &amp; Web UI/UX Designer (3+ năm: 2021 – Hiện tại)</w:t>
-              <w:br/>
-              <w:t>5. IT Support &amp; Kỹ thuật viên Phần cứng PC (Xuyên suốt các giai đoạn)</w:t>
+              <w:t>4. IT Phần cứng PC: Lắp ráp phần cứng PC/Laptop, cài đặt hệ điều hành/phần mềm, sửa chữa và mạng LAN văn phòng</w:t>
             </w:r>
           </w:p>
         </w:tc>

</xml_diff>